<commit_message>
vault backup: 2026-09-16 16:01:19
</commit_message>
<xml_diff>
--- a/説教準備/草稿20260920マルコ4-21-25 「さらに与えられる。」.docx
+++ b/説教準備/草稿20260920マルコ4-21-25 「さらに与えられる。」.docx
@@ -515,7 +515,23 @@
           <w:rFonts w:ascii="Meiryo UI" w:hAnsi="Meiryo UI"/>
           <w:sz w:val="21"/>
         </w:rPr>
-        <w:t xml:space="preserve">22節は「なぜなら」という言葉で始まります。</w:t>
+        <w:t xml:space="preserve">22節は、原語では「なぜなら」という言葉で始まっています。</w:t>
+      </w:r>
+    </w:p>
+    <w:p>
+      <w:pPr>
+        <w:pStyle w:val="a8"/>
+        <w:rPr>
+          <w:rFonts w:ascii="Meiryo UI" w:hAnsi="Meiryo UI"/>
+          <w:sz w:val="21"/>
+        </w:rPr>
+      </w:pPr>
+      <w:r>
+        <w:rPr>
+          <w:rFonts w:ascii="Meiryo UI" w:hAnsi="Meiryo UI"/>
+          <w:sz w:val="21"/>
+        </w:rPr>
+        <w:t xml:space="preserve">日本語の訳には出てきませんが、原文にはその言葉があります。</w:t>
       </w:r>
     </w:p>
     <w:p>
@@ -3244,24 +3260,106 @@
           <w:rFonts w:ascii="Meiryo UI" w:hAnsi="Meiryo UI"/>
           <w:sz w:val="21"/>
         </w:rPr>
-        <w:t xml:space="preserve">22節は「なぜなら」で始まります。</w:t>
-      </w:r>
-    </w:p>
-    <w:p>
-      <w:pPr>
-        <w:pStyle w:val="a8"/>
-        <w:rPr>
-          <w:rFonts w:ascii="Meiryo UI" w:hAnsi="Meiryo UI"/>
-          <w:sz w:val="21"/>
-        </w:rPr>
-      </w:pPr>
-      <w:r>
-        <w:rPr>
-          <w:rFonts w:ascii="Meiryo UI" w:hAnsi="Meiryo UI"/>
-          <w:sz w:val="21"/>
-        </w:rPr>
-        <w:t xml:space="preserve">ですからこの節は、21節の理由です。</w:t>
-      </w:r>
+        <w:t xml:space="preserve">ここで、原語のことを一つ申し上げます。</w:t>
+      </w:r>
+    </w:p>
+    <w:p>
+      <w:pPr>
+        <w:pStyle w:val="a8"/>
+        <w:rPr>
+          <w:rFonts w:ascii="Meiryo UI" w:hAnsi="Meiryo UI"/>
+          <w:sz w:val="21"/>
+        </w:rPr>
+      </w:pPr>
+      <w:r>
+        <w:rPr>
+          <w:rFonts w:ascii="Meiryo UI" w:hAnsi="Meiryo UI"/>
+          <w:sz w:val="21"/>
+        </w:rPr>
+        <w:t xml:space="preserve">※22節は、原文では「なぜなら」という言葉で始まっています。</w:t>
+      </w:r>
+    </w:p>
+    <w:p>
+      <w:pPr>
+        <w:pStyle w:val="a8"/>
+        <w:rPr>
+          <w:rFonts w:ascii="Meiryo UI" w:hAnsi="Meiryo UI"/>
+          <w:sz w:val="21"/>
+        </w:rPr>
+      </w:pPr>
+      <w:r>
+        <w:rPr>
+          <w:rFonts w:ascii="Meiryo UI" w:hAnsi="Meiryo UI"/>
+          <w:sz w:val="21"/>
+        </w:rPr>
+        <w:t xml:space="preserve">新改訳の日本語には訳されていません。</w:t>
+      </w:r>
+    </w:p>
+    <w:p>
+      <w:pPr>
+        <w:pStyle w:val="a8"/>
+        <w:rPr>
+          <w:rFonts w:ascii="Meiryo UI" w:hAnsi="Meiryo UI"/>
+          <w:sz w:val="21"/>
+        </w:rPr>
+      </w:pPr>
+      <w:r>
+        <w:rPr>
+          <w:rFonts w:ascii="Meiryo UI" w:hAnsi="Meiryo UI"/>
+          <w:sz w:val="21"/>
+        </w:rPr>
+        <w:t xml:space="preserve">ですから、日本語で読んでいるかぎり、21節と22節は二つの独立した文に見えます。</w:t>
+      </w:r>
+    </w:p>
+    <w:p>
+      <w:pPr>
+        <w:pStyle w:val="a8"/>
+        <w:rPr>
+          <w:rFonts w:ascii="Meiryo UI" w:hAnsi="Meiryo UI"/>
+          <w:sz w:val="21"/>
+        </w:rPr>
+      </w:pPr>
+    </w:p>
+    <w:p>
+      <w:pPr>
+        <w:pStyle w:val="a8"/>
+        <w:rPr>
+          <w:rFonts w:ascii="Meiryo UI" w:hAnsi="Meiryo UI"/>
+          <w:sz w:val="21"/>
+        </w:rPr>
+      </w:pPr>
+      <w:r>
+        <w:rPr>
+          <w:rFonts w:ascii="Meiryo UI" w:hAnsi="Meiryo UI"/>
+          <w:sz w:val="21"/>
+        </w:rPr>
+        <w:t xml:space="preserve">けれども原文では、この二つはつながっています。</w:t>
+      </w:r>
+    </w:p>
+    <w:p>
+      <w:pPr>
+        <w:pStyle w:val="a8"/>
+        <w:rPr>
+          <w:rFonts w:ascii="Meiryo UI" w:hAnsi="Meiryo UI"/>
+          <w:sz w:val="21"/>
+        </w:rPr>
+      </w:pPr>
+      <w:r>
+        <w:rPr>
+          <w:rFonts w:ascii="Meiryo UI" w:hAnsi="Meiryo UI"/>
+          <w:sz w:val="21"/>
+        </w:rPr>
+        <w:t xml:space="preserve">22節は、21節の理由を述べた文です。</w:t>
+      </w:r>
+    </w:p>
+    <w:p>
+      <w:pPr>
+        <w:pStyle w:val="a8"/>
+        <w:rPr>
+          <w:rFonts w:ascii="Meiryo UI" w:hAnsi="Meiryo UI"/>
+          <w:sz w:val="21"/>
+        </w:rPr>
+      </w:pPr>
     </w:p>
     <w:p>
       <w:pPr>
@@ -3317,7 +3415,7 @@
           <w:rFonts w:ascii="Meiryo UI" w:hAnsi="Meiryo UI"/>
           <w:sz w:val="21"/>
         </w:rPr>
-        <w:t xml:space="preserve">原語は、もう少し強い言い方をしています。</w:t>
+        <w:t xml:space="preserve">原語は、日本語よりも強い言い方をしています。</w:t>
       </w:r>
     </w:p>
     <w:p>

</xml_diff>